<commit_message>
Updated average report feature
</commit_message>
<xml_diff>
--- a/User_Guide.docx
+++ b/User_Guide.docx
@@ -173,10 +173,7 @@
     </w:p>
     <w:p>
       <w:pPr>
-        <w:numPr>
-          <w:ilvl w:val="0"/>
-          <w:numId w:val="2"/>
-        </w:numPr>
+        <w:ind w:left="5954"/>
         <w:rPr>
           <w:sz w:val="28"/>
           <w:szCs w:val="28"/>
@@ -192,29 +189,37 @@
     </w:p>
     <w:p>
       <w:pPr>
-        <w:numPr>
-          <w:ilvl w:val="0"/>
-          <w:numId w:val="2"/>
-        </w:numPr>
-        <w:rPr>
-          <w:sz w:val="28"/>
-          <w:szCs w:val="28"/>
-        </w:rPr>
-      </w:pPr>
-      <w:r>
-        <w:rPr>
-          <w:sz w:val="28"/>
-          <w:szCs w:val="28"/>
-        </w:rPr>
-        <w:t xml:space="preserve">Flask </w:t>
-      </w:r>
-    </w:p>
-    <w:p>
-      <w:pPr>
-        <w:numPr>
-          <w:ilvl w:val="0"/>
-          <w:numId w:val="2"/>
-        </w:numPr>
+        <w:ind w:left="5954"/>
+        <w:rPr>
+          <w:sz w:val="28"/>
+          <w:szCs w:val="28"/>
+        </w:rPr>
+      </w:pPr>
+      <w:r>
+        <w:rPr>
+          <w:sz w:val="28"/>
+          <w:szCs w:val="28"/>
+        </w:rPr>
+        <w:t>Flas</w:t>
+      </w:r>
+      <w:r>
+        <w:rPr>
+          <w:sz w:val="28"/>
+          <w:szCs w:val="28"/>
+        </w:rPr>
+        <w:t>k</w:t>
+      </w:r>
+      <w:r>
+        <w:rPr>
+          <w:sz w:val="28"/>
+          <w:szCs w:val="28"/>
+        </w:rPr>
+        <w:t xml:space="preserve"> </w:t>
+      </w:r>
+    </w:p>
+    <w:p>
+      <w:pPr>
+        <w:ind w:left="5954"/>
         <w:rPr>
           <w:sz w:val="28"/>
           <w:szCs w:val="28"/>
@@ -230,10 +235,7 @@
     </w:p>
     <w:p>
       <w:pPr>
-        <w:numPr>
-          <w:ilvl w:val="0"/>
-          <w:numId w:val="2"/>
-        </w:numPr>
+        <w:ind w:left="5954"/>
         <w:rPr>
           <w:sz w:val="28"/>
           <w:szCs w:val="28"/>
@@ -249,10 +251,7 @@
     </w:p>
     <w:p>
       <w:pPr>
-        <w:numPr>
-          <w:ilvl w:val="0"/>
-          <w:numId w:val="2"/>
-        </w:numPr>
+        <w:ind w:left="5954"/>
         <w:rPr>
           <w:sz w:val="28"/>
           <w:szCs w:val="28"/>
@@ -813,14 +812,7 @@
                 <w:sz w:val="28"/>
                 <w:szCs w:val="28"/>
               </w:rPr>
-              <w:t xml:space="preserve">     </w:t>
-            </w:r>
-            <w:r>
-              <w:rPr>
-                <w:sz w:val="28"/>
-                <w:szCs w:val="28"/>
-              </w:rPr>
-              <w:t>Rahul</w:t>
+              <w:t xml:space="preserve">     Rahul</w:t>
             </w:r>
           </w:p>
         </w:tc>
@@ -1197,14 +1189,7 @@
                 <w:sz w:val="28"/>
                 <w:szCs w:val="28"/>
               </w:rPr>
-              <w:t xml:space="preserve">      </w:t>
-            </w:r>
-            <w:r>
-              <w:rPr>
-                <w:sz w:val="28"/>
-                <w:szCs w:val="28"/>
-              </w:rPr>
-              <w:t>Mathematics</w:t>
+              <w:t xml:space="preserve">      Mathematics</w:t>
             </w:r>
           </w:p>
         </w:tc>
@@ -1226,14 +1211,7 @@
                 <w:sz w:val="28"/>
                 <w:szCs w:val="28"/>
               </w:rPr>
-              <w:t xml:space="preserve">               </w:t>
-            </w:r>
-            <w:r>
-              <w:rPr>
-                <w:sz w:val="28"/>
-                <w:szCs w:val="28"/>
-              </w:rPr>
-              <w:t>95</w:t>
+              <w:t xml:space="preserve">               95</w:t>
             </w:r>
           </w:p>
         </w:tc>
@@ -2672,6 +2650,232 @@
     </w:lvl>
   </w:abstractNum>
   <w:abstractNum w:abstractNumId="1" w15:restartNumberingAfterBreak="0">
+    <w:nsid w:val="120D3D5E"/>
+    <w:multiLevelType w:val="hybridMultilevel"/>
+    <w:tmpl w:val="038EAFC8"/>
+    <w:lvl w:ilvl="0" w:tplc="40090001">
+      <w:start w:val="1"/>
+      <w:numFmt w:val="bullet"/>
+      <w:lvlText w:val=""/>
+      <w:lvlJc w:val="left"/>
+      <w:pPr>
+        <w:ind w:left="6674" w:hanging="360"/>
+      </w:pPr>
+      <w:rPr>
+        <w:rFonts w:ascii="Symbol" w:hAnsi="Symbol" w:hint="default"/>
+      </w:rPr>
+    </w:lvl>
+    <w:lvl w:ilvl="1" w:tplc="40090003" w:tentative="1">
+      <w:start w:val="1"/>
+      <w:numFmt w:val="bullet"/>
+      <w:lvlText w:val="o"/>
+      <w:lvlJc w:val="left"/>
+      <w:pPr>
+        <w:ind w:left="7394" w:hanging="360"/>
+      </w:pPr>
+      <w:rPr>
+        <w:rFonts w:ascii="Courier New" w:hAnsi="Courier New" w:cs="Courier New" w:hint="default"/>
+      </w:rPr>
+    </w:lvl>
+    <w:lvl w:ilvl="2" w:tplc="40090005" w:tentative="1">
+      <w:start w:val="1"/>
+      <w:numFmt w:val="bullet"/>
+      <w:lvlText w:val=""/>
+      <w:lvlJc w:val="left"/>
+      <w:pPr>
+        <w:ind w:left="8114" w:hanging="360"/>
+      </w:pPr>
+      <w:rPr>
+        <w:rFonts w:ascii="Wingdings" w:hAnsi="Wingdings" w:hint="default"/>
+      </w:rPr>
+    </w:lvl>
+    <w:lvl w:ilvl="3" w:tplc="40090001" w:tentative="1">
+      <w:start w:val="1"/>
+      <w:numFmt w:val="bullet"/>
+      <w:lvlText w:val=""/>
+      <w:lvlJc w:val="left"/>
+      <w:pPr>
+        <w:ind w:left="8834" w:hanging="360"/>
+      </w:pPr>
+      <w:rPr>
+        <w:rFonts w:ascii="Symbol" w:hAnsi="Symbol" w:hint="default"/>
+      </w:rPr>
+    </w:lvl>
+    <w:lvl w:ilvl="4" w:tplc="40090003" w:tentative="1">
+      <w:start w:val="1"/>
+      <w:numFmt w:val="bullet"/>
+      <w:lvlText w:val="o"/>
+      <w:lvlJc w:val="left"/>
+      <w:pPr>
+        <w:ind w:left="9554" w:hanging="360"/>
+      </w:pPr>
+      <w:rPr>
+        <w:rFonts w:ascii="Courier New" w:hAnsi="Courier New" w:cs="Courier New" w:hint="default"/>
+      </w:rPr>
+    </w:lvl>
+    <w:lvl w:ilvl="5" w:tplc="40090005" w:tentative="1">
+      <w:start w:val="1"/>
+      <w:numFmt w:val="bullet"/>
+      <w:lvlText w:val=""/>
+      <w:lvlJc w:val="left"/>
+      <w:pPr>
+        <w:ind w:left="10274" w:hanging="360"/>
+      </w:pPr>
+      <w:rPr>
+        <w:rFonts w:ascii="Wingdings" w:hAnsi="Wingdings" w:hint="default"/>
+      </w:rPr>
+    </w:lvl>
+    <w:lvl w:ilvl="6" w:tplc="40090001" w:tentative="1">
+      <w:start w:val="1"/>
+      <w:numFmt w:val="bullet"/>
+      <w:lvlText w:val=""/>
+      <w:lvlJc w:val="left"/>
+      <w:pPr>
+        <w:ind w:left="10994" w:hanging="360"/>
+      </w:pPr>
+      <w:rPr>
+        <w:rFonts w:ascii="Symbol" w:hAnsi="Symbol" w:hint="default"/>
+      </w:rPr>
+    </w:lvl>
+    <w:lvl w:ilvl="7" w:tplc="40090003" w:tentative="1">
+      <w:start w:val="1"/>
+      <w:numFmt w:val="bullet"/>
+      <w:lvlText w:val="o"/>
+      <w:lvlJc w:val="left"/>
+      <w:pPr>
+        <w:ind w:left="11714" w:hanging="360"/>
+      </w:pPr>
+      <w:rPr>
+        <w:rFonts w:ascii="Courier New" w:hAnsi="Courier New" w:cs="Courier New" w:hint="default"/>
+      </w:rPr>
+    </w:lvl>
+    <w:lvl w:ilvl="8" w:tplc="40090005" w:tentative="1">
+      <w:start w:val="1"/>
+      <w:numFmt w:val="bullet"/>
+      <w:lvlText w:val=""/>
+      <w:lvlJc w:val="left"/>
+      <w:pPr>
+        <w:ind w:left="12434" w:hanging="360"/>
+      </w:pPr>
+      <w:rPr>
+        <w:rFonts w:ascii="Wingdings" w:hAnsi="Wingdings" w:hint="default"/>
+      </w:rPr>
+    </w:lvl>
+  </w:abstractNum>
+  <w:abstractNum w:abstractNumId="2" w15:restartNumberingAfterBreak="0">
+    <w:nsid w:val="151B5FBB"/>
+    <w:multiLevelType w:val="hybridMultilevel"/>
+    <w:tmpl w:val="969E9904"/>
+    <w:lvl w:ilvl="0" w:tplc="40090001">
+      <w:start w:val="1"/>
+      <w:numFmt w:val="bullet"/>
+      <w:lvlText w:val=""/>
+      <w:lvlJc w:val="left"/>
+      <w:pPr>
+        <w:ind w:left="6674" w:hanging="360"/>
+      </w:pPr>
+      <w:rPr>
+        <w:rFonts w:ascii="Symbol" w:hAnsi="Symbol" w:hint="default"/>
+      </w:rPr>
+    </w:lvl>
+    <w:lvl w:ilvl="1" w:tplc="40090003" w:tentative="1">
+      <w:start w:val="1"/>
+      <w:numFmt w:val="bullet"/>
+      <w:lvlText w:val="o"/>
+      <w:lvlJc w:val="left"/>
+      <w:pPr>
+        <w:ind w:left="7394" w:hanging="360"/>
+      </w:pPr>
+      <w:rPr>
+        <w:rFonts w:ascii="Courier New" w:hAnsi="Courier New" w:cs="Courier New" w:hint="default"/>
+      </w:rPr>
+    </w:lvl>
+    <w:lvl w:ilvl="2" w:tplc="40090005" w:tentative="1">
+      <w:start w:val="1"/>
+      <w:numFmt w:val="bullet"/>
+      <w:lvlText w:val=""/>
+      <w:lvlJc w:val="left"/>
+      <w:pPr>
+        <w:ind w:left="8114" w:hanging="360"/>
+      </w:pPr>
+      <w:rPr>
+        <w:rFonts w:ascii="Wingdings" w:hAnsi="Wingdings" w:hint="default"/>
+      </w:rPr>
+    </w:lvl>
+    <w:lvl w:ilvl="3" w:tplc="40090001" w:tentative="1">
+      <w:start w:val="1"/>
+      <w:numFmt w:val="bullet"/>
+      <w:lvlText w:val=""/>
+      <w:lvlJc w:val="left"/>
+      <w:pPr>
+        <w:ind w:left="8834" w:hanging="360"/>
+      </w:pPr>
+      <w:rPr>
+        <w:rFonts w:ascii="Symbol" w:hAnsi="Symbol" w:hint="default"/>
+      </w:rPr>
+    </w:lvl>
+    <w:lvl w:ilvl="4" w:tplc="40090003" w:tentative="1">
+      <w:start w:val="1"/>
+      <w:numFmt w:val="bullet"/>
+      <w:lvlText w:val="o"/>
+      <w:lvlJc w:val="left"/>
+      <w:pPr>
+        <w:ind w:left="9554" w:hanging="360"/>
+      </w:pPr>
+      <w:rPr>
+        <w:rFonts w:ascii="Courier New" w:hAnsi="Courier New" w:cs="Courier New" w:hint="default"/>
+      </w:rPr>
+    </w:lvl>
+    <w:lvl w:ilvl="5" w:tplc="40090005" w:tentative="1">
+      <w:start w:val="1"/>
+      <w:numFmt w:val="bullet"/>
+      <w:lvlText w:val=""/>
+      <w:lvlJc w:val="left"/>
+      <w:pPr>
+        <w:ind w:left="10274" w:hanging="360"/>
+      </w:pPr>
+      <w:rPr>
+        <w:rFonts w:ascii="Wingdings" w:hAnsi="Wingdings" w:hint="default"/>
+      </w:rPr>
+    </w:lvl>
+    <w:lvl w:ilvl="6" w:tplc="40090001" w:tentative="1">
+      <w:start w:val="1"/>
+      <w:numFmt w:val="bullet"/>
+      <w:lvlText w:val=""/>
+      <w:lvlJc w:val="left"/>
+      <w:pPr>
+        <w:ind w:left="10994" w:hanging="360"/>
+      </w:pPr>
+      <w:rPr>
+        <w:rFonts w:ascii="Symbol" w:hAnsi="Symbol" w:hint="default"/>
+      </w:rPr>
+    </w:lvl>
+    <w:lvl w:ilvl="7" w:tplc="40090003" w:tentative="1">
+      <w:start w:val="1"/>
+      <w:numFmt w:val="bullet"/>
+      <w:lvlText w:val="o"/>
+      <w:lvlJc w:val="left"/>
+      <w:pPr>
+        <w:ind w:left="11714" w:hanging="360"/>
+      </w:pPr>
+      <w:rPr>
+        <w:rFonts w:ascii="Courier New" w:hAnsi="Courier New" w:cs="Courier New" w:hint="default"/>
+      </w:rPr>
+    </w:lvl>
+    <w:lvl w:ilvl="8" w:tplc="40090005" w:tentative="1">
+      <w:start w:val="1"/>
+      <w:numFmt w:val="bullet"/>
+      <w:lvlText w:val=""/>
+      <w:lvlJc w:val="left"/>
+      <w:pPr>
+        <w:ind w:left="12434" w:hanging="360"/>
+      </w:pPr>
+      <w:rPr>
+        <w:rFonts w:ascii="Wingdings" w:hAnsi="Wingdings" w:hint="default"/>
+      </w:rPr>
+    </w:lvl>
+  </w:abstractNum>
+  <w:abstractNum w:abstractNumId="3" w15:restartNumberingAfterBreak="0">
     <w:nsid w:val="1AC1123F"/>
     <w:multiLevelType w:val="multilevel"/>
     <w:tmpl w:val="7BE0DBE8"/>
@@ -2820,7 +3024,7 @@
       </w:rPr>
     </w:lvl>
   </w:abstractNum>
-  <w:abstractNum w:abstractNumId="2" w15:restartNumberingAfterBreak="0">
+  <w:abstractNum w:abstractNumId="4" w15:restartNumberingAfterBreak="0">
     <w:nsid w:val="1C69246B"/>
     <w:multiLevelType w:val="multilevel"/>
     <w:tmpl w:val="C5BAFA56"/>
@@ -2933,7 +3137,7 @@
       </w:pPr>
     </w:lvl>
   </w:abstractNum>
-  <w:abstractNum w:abstractNumId="3" w15:restartNumberingAfterBreak="0">
+  <w:abstractNum w:abstractNumId="5" w15:restartNumberingAfterBreak="0">
     <w:nsid w:val="22A83044"/>
     <w:multiLevelType w:val="multilevel"/>
     <w:tmpl w:val="A7D2BE0A"/>
@@ -3046,7 +3250,7 @@
       </w:pPr>
     </w:lvl>
   </w:abstractNum>
-  <w:abstractNum w:abstractNumId="4" w15:restartNumberingAfterBreak="0">
+  <w:abstractNum w:abstractNumId="6" w15:restartNumberingAfterBreak="0">
     <w:nsid w:val="28EB73F8"/>
     <w:multiLevelType w:val="multilevel"/>
     <w:tmpl w:val="D664709C"/>
@@ -3195,7 +3399,7 @@
       </w:rPr>
     </w:lvl>
   </w:abstractNum>
-  <w:abstractNum w:abstractNumId="5" w15:restartNumberingAfterBreak="0">
+  <w:abstractNum w:abstractNumId="7" w15:restartNumberingAfterBreak="0">
     <w:nsid w:val="2C2D6738"/>
     <w:multiLevelType w:val="multilevel"/>
     <w:tmpl w:val="234A45AC"/>
@@ -3308,7 +3512,120 @@
       </w:pPr>
     </w:lvl>
   </w:abstractNum>
-  <w:abstractNum w:abstractNumId="6" w15:restartNumberingAfterBreak="0">
+  <w:abstractNum w:abstractNumId="8" w15:restartNumberingAfterBreak="0">
+    <w:nsid w:val="46922270"/>
+    <w:multiLevelType w:val="hybridMultilevel"/>
+    <w:tmpl w:val="A152689A"/>
+    <w:lvl w:ilvl="0" w:tplc="40090001">
+      <w:start w:val="1"/>
+      <w:numFmt w:val="bullet"/>
+      <w:lvlText w:val=""/>
+      <w:lvlJc w:val="left"/>
+      <w:pPr>
+        <w:ind w:left="6674" w:hanging="360"/>
+      </w:pPr>
+      <w:rPr>
+        <w:rFonts w:ascii="Symbol" w:hAnsi="Symbol" w:hint="default"/>
+      </w:rPr>
+    </w:lvl>
+    <w:lvl w:ilvl="1" w:tplc="40090003" w:tentative="1">
+      <w:start w:val="1"/>
+      <w:numFmt w:val="bullet"/>
+      <w:lvlText w:val="o"/>
+      <w:lvlJc w:val="left"/>
+      <w:pPr>
+        <w:ind w:left="7394" w:hanging="360"/>
+      </w:pPr>
+      <w:rPr>
+        <w:rFonts w:ascii="Courier New" w:hAnsi="Courier New" w:cs="Courier New" w:hint="default"/>
+      </w:rPr>
+    </w:lvl>
+    <w:lvl w:ilvl="2" w:tplc="40090005" w:tentative="1">
+      <w:start w:val="1"/>
+      <w:numFmt w:val="bullet"/>
+      <w:lvlText w:val=""/>
+      <w:lvlJc w:val="left"/>
+      <w:pPr>
+        <w:ind w:left="8114" w:hanging="360"/>
+      </w:pPr>
+      <w:rPr>
+        <w:rFonts w:ascii="Wingdings" w:hAnsi="Wingdings" w:hint="default"/>
+      </w:rPr>
+    </w:lvl>
+    <w:lvl w:ilvl="3" w:tplc="40090001" w:tentative="1">
+      <w:start w:val="1"/>
+      <w:numFmt w:val="bullet"/>
+      <w:lvlText w:val=""/>
+      <w:lvlJc w:val="left"/>
+      <w:pPr>
+        <w:ind w:left="8834" w:hanging="360"/>
+      </w:pPr>
+      <w:rPr>
+        <w:rFonts w:ascii="Symbol" w:hAnsi="Symbol" w:hint="default"/>
+      </w:rPr>
+    </w:lvl>
+    <w:lvl w:ilvl="4" w:tplc="40090003" w:tentative="1">
+      <w:start w:val="1"/>
+      <w:numFmt w:val="bullet"/>
+      <w:lvlText w:val="o"/>
+      <w:lvlJc w:val="left"/>
+      <w:pPr>
+        <w:ind w:left="9554" w:hanging="360"/>
+      </w:pPr>
+      <w:rPr>
+        <w:rFonts w:ascii="Courier New" w:hAnsi="Courier New" w:cs="Courier New" w:hint="default"/>
+      </w:rPr>
+    </w:lvl>
+    <w:lvl w:ilvl="5" w:tplc="40090005" w:tentative="1">
+      <w:start w:val="1"/>
+      <w:numFmt w:val="bullet"/>
+      <w:lvlText w:val=""/>
+      <w:lvlJc w:val="left"/>
+      <w:pPr>
+        <w:ind w:left="10274" w:hanging="360"/>
+      </w:pPr>
+      <w:rPr>
+        <w:rFonts w:ascii="Wingdings" w:hAnsi="Wingdings" w:hint="default"/>
+      </w:rPr>
+    </w:lvl>
+    <w:lvl w:ilvl="6" w:tplc="40090001" w:tentative="1">
+      <w:start w:val="1"/>
+      <w:numFmt w:val="bullet"/>
+      <w:lvlText w:val=""/>
+      <w:lvlJc w:val="left"/>
+      <w:pPr>
+        <w:ind w:left="10994" w:hanging="360"/>
+      </w:pPr>
+      <w:rPr>
+        <w:rFonts w:ascii="Symbol" w:hAnsi="Symbol" w:hint="default"/>
+      </w:rPr>
+    </w:lvl>
+    <w:lvl w:ilvl="7" w:tplc="40090003" w:tentative="1">
+      <w:start w:val="1"/>
+      <w:numFmt w:val="bullet"/>
+      <w:lvlText w:val="o"/>
+      <w:lvlJc w:val="left"/>
+      <w:pPr>
+        <w:ind w:left="11714" w:hanging="360"/>
+      </w:pPr>
+      <w:rPr>
+        <w:rFonts w:ascii="Courier New" w:hAnsi="Courier New" w:cs="Courier New" w:hint="default"/>
+      </w:rPr>
+    </w:lvl>
+    <w:lvl w:ilvl="8" w:tplc="40090005" w:tentative="1">
+      <w:start w:val="1"/>
+      <w:numFmt w:val="bullet"/>
+      <w:lvlText w:val=""/>
+      <w:lvlJc w:val="left"/>
+      <w:pPr>
+        <w:ind w:left="12434" w:hanging="360"/>
+      </w:pPr>
+      <w:rPr>
+        <w:rFonts w:ascii="Wingdings" w:hAnsi="Wingdings" w:hint="default"/>
+      </w:rPr>
+    </w:lvl>
+  </w:abstractNum>
+  <w:abstractNum w:abstractNumId="9" w15:restartNumberingAfterBreak="0">
     <w:nsid w:val="476B0761"/>
     <w:multiLevelType w:val="multilevel"/>
     <w:tmpl w:val="AE103ADE"/>
@@ -3421,7 +3738,7 @@
       </w:pPr>
     </w:lvl>
   </w:abstractNum>
-  <w:abstractNum w:abstractNumId="7" w15:restartNumberingAfterBreak="0">
+  <w:abstractNum w:abstractNumId="10" w15:restartNumberingAfterBreak="0">
     <w:nsid w:val="64BD6D14"/>
     <w:multiLevelType w:val="multilevel"/>
     <w:tmpl w:val="EFCE4052"/>
@@ -3534,7 +3851,7 @@
       </w:pPr>
     </w:lvl>
   </w:abstractNum>
-  <w:abstractNum w:abstractNumId="8" w15:restartNumberingAfterBreak="0">
+  <w:abstractNum w:abstractNumId="11" w15:restartNumberingAfterBreak="0">
     <w:nsid w:val="79841CF1"/>
     <w:multiLevelType w:val="multilevel"/>
     <w:tmpl w:val="FDC87CA2"/>
@@ -3684,31 +4001,40 @@
     </w:lvl>
   </w:abstractNum>
   <w:num w:numId="1" w16cid:durableId="1181162066">
-    <w:abstractNumId w:val="4"/>
+    <w:abstractNumId w:val="6"/>
   </w:num>
   <w:num w:numId="2" w16cid:durableId="1108306259">
     <w:abstractNumId w:val="0"/>
   </w:num>
   <w:num w:numId="3" w16cid:durableId="1885747439">
+    <w:abstractNumId w:val="11"/>
+  </w:num>
+  <w:num w:numId="4" w16cid:durableId="785082198">
+    <w:abstractNumId w:val="4"/>
+  </w:num>
+  <w:num w:numId="5" w16cid:durableId="731269430">
+    <w:abstractNumId w:val="7"/>
+  </w:num>
+  <w:num w:numId="6" w16cid:durableId="2085494564">
+    <w:abstractNumId w:val="5"/>
+  </w:num>
+  <w:num w:numId="7" w16cid:durableId="1834369165">
+    <w:abstractNumId w:val="10"/>
+  </w:num>
+  <w:num w:numId="8" w16cid:durableId="2046325615">
+    <w:abstractNumId w:val="3"/>
+  </w:num>
+  <w:num w:numId="9" w16cid:durableId="1567108072">
+    <w:abstractNumId w:val="9"/>
+  </w:num>
+  <w:num w:numId="10" w16cid:durableId="14038266">
+    <w:abstractNumId w:val="2"/>
+  </w:num>
+  <w:num w:numId="11" w16cid:durableId="702368837">
     <w:abstractNumId w:val="8"/>
   </w:num>
-  <w:num w:numId="4" w16cid:durableId="785082198">
-    <w:abstractNumId w:val="2"/>
-  </w:num>
-  <w:num w:numId="5" w16cid:durableId="731269430">
-    <w:abstractNumId w:val="5"/>
-  </w:num>
-  <w:num w:numId="6" w16cid:durableId="2085494564">
-    <w:abstractNumId w:val="3"/>
-  </w:num>
-  <w:num w:numId="7" w16cid:durableId="1834369165">
-    <w:abstractNumId w:val="7"/>
-  </w:num>
-  <w:num w:numId="8" w16cid:durableId="2046325615">
+  <w:num w:numId="12" w16cid:durableId="1441219078">
     <w:abstractNumId w:val="1"/>
-  </w:num>
-  <w:num w:numId="9" w16cid:durableId="1567108072">
-    <w:abstractNumId w:val="6"/>
   </w:num>
 </w:numbering>
 </file>
@@ -4316,6 +4642,7 @@
   <w:style w:type="character" w:default="1" w:styleId="DefaultParagraphFont">
     <w:name w:val="Default Paragraph Font"/>
     <w:uiPriority w:val="1"/>
+    <w:semiHidden/>
     <w:unhideWhenUsed/>
   </w:style>
   <w:style w:type="table" w:default="1" w:styleId="TableNormal">

</xml_diff>